<commit_message>
fix(lists): emit Word-canonical numbering definitions
The generated numbering.xml deviated from real Word output in ways that
can make Word and other consumers fail to render list markers: w:num
instances were emitted before their w:abstractNum definitions (parsers
that resolve abstractNumId while reading w:num fail to find the
definition), levels used non-schema child order (numFmt/lvlText/start),
and abstractNums lacked the nsid/multiLevelType/tmpl metadata Word
always writes. Align with Word's exact structure: abstractNum first,
schema-ordered levels (start, numFmt, lvlText, lvlJc, pPr with
Word-style hanging indents), hybridMultilevel + deterministic nsid/tmpl.
Verified against a real Word-authored document's numbering.xml and a
real-document open/edit/save round trip.
</commit_message>
<xml_diff>
--- a/examples/06-lists/output.docx
+++ b/examples/06-lists/output.docx
@@ -326,6 +326,350 @@
 
 <file path=word/numbering.xml><?xml version="1.0" encoding="utf-8"?>
 <w:numbering xmlns:w="http://schemas.openxmlformats.org/wordprocessingml/2006/main">
+  <w:abstractNum w:abstractNumId="0">
+    <w:nsid w:val="20000000"/>
+    <w:multiLevelType w:val="hybridMultilevel"/>
+    <w:tmpl w:val="40000000"/>
+    <w:lvl w:ilvl="0">
+      <w:start w:val="1"/>
+      <w:numFmt w:val="bullet"/>
+      <w:lvlText w:val="•"/>
+      <w:lvlJc w:val="left"/>
+      <w:pPr>
+        <w:ind w:left="720" w:hanging="360"/>
+      </w:pPr>
+    </w:lvl>
+    <w:lvl w:ilvl="1">
+      <w:start w:val="1"/>
+      <w:numFmt w:val="bullet"/>
+      <w:lvlText w:val="◦"/>
+      <w:lvlJc w:val="left"/>
+      <w:pPr>
+        <w:ind w:left="1440" w:hanging="360"/>
+      </w:pPr>
+    </w:lvl>
+    <w:lvl w:ilvl="2">
+      <w:start w:val="1"/>
+      <w:numFmt w:val="bullet"/>
+      <w:lvlText w:val="▪"/>
+      <w:lvlJc w:val="left"/>
+      <w:pPr>
+        <w:ind w:left="2160" w:hanging="360"/>
+      </w:pPr>
+    </w:lvl>
+    <w:lvl w:ilvl="3">
+      <w:start w:val="1"/>
+      <w:numFmt w:val="bullet"/>
+      <w:lvlText w:val="▫"/>
+      <w:lvlJc w:val="left"/>
+      <w:pPr>
+        <w:ind w:left="2880" w:hanging="360"/>
+      </w:pPr>
+    </w:lvl>
+    <w:lvl w:ilvl="4">
+      <w:start w:val="1"/>
+      <w:numFmt w:val="bullet"/>
+      <w:lvlText w:val="•"/>
+      <w:lvlJc w:val="left"/>
+      <w:pPr>
+        <w:ind w:left="3600" w:hanging="360"/>
+      </w:pPr>
+    </w:lvl>
+    <w:lvl w:ilvl="5">
+      <w:start w:val="1"/>
+      <w:numFmt w:val="bullet"/>
+      <w:lvlText w:val="◦"/>
+      <w:lvlJc w:val="left"/>
+      <w:pPr>
+        <w:ind w:left="4320" w:hanging="360"/>
+      </w:pPr>
+    </w:lvl>
+    <w:lvl w:ilvl="6">
+      <w:start w:val="1"/>
+      <w:numFmt w:val="bullet"/>
+      <w:lvlText w:val="▪"/>
+      <w:lvlJc w:val="left"/>
+      <w:pPr>
+        <w:ind w:left="5040" w:hanging="360"/>
+      </w:pPr>
+    </w:lvl>
+    <w:lvl w:ilvl="7">
+      <w:start w:val="1"/>
+      <w:numFmt w:val="bullet"/>
+      <w:lvlText w:val="▫"/>
+      <w:lvlJc w:val="left"/>
+      <w:pPr>
+        <w:ind w:left="5760" w:hanging="360"/>
+      </w:pPr>
+    </w:lvl>
+    <w:lvl w:ilvl="8">
+      <w:start w:val="1"/>
+      <w:numFmt w:val="bullet"/>
+      <w:lvlText w:val="•"/>
+      <w:lvlJc w:val="left"/>
+      <w:pPr>
+        <w:ind w:left="6480" w:hanging="360"/>
+      </w:pPr>
+    </w:lvl>
+  </w:abstractNum>
+  <w:abstractNum w:abstractNumId="1">
+    <w:nsid w:val="20000001"/>
+    <w:multiLevelType w:val="hybridMultilevel"/>
+    <w:tmpl w:val="40000001"/>
+    <w:lvl w:ilvl="0">
+      <w:start w:val="1"/>
+      <w:numFmt w:val="decimal"/>
+      <w:lvlText w:val="%1."/>
+      <w:lvlJc w:val="left"/>
+      <w:pPr>
+        <w:ind w:left="720" w:hanging="360"/>
+      </w:pPr>
+    </w:lvl>
+    <w:lvl w:ilvl="1">
+      <w:start w:val="1"/>
+      <w:numFmt w:val="decimal"/>
+      <w:lvlText w:val="%2."/>
+      <w:lvlJc w:val="left"/>
+      <w:pPr>
+        <w:ind w:left="1440" w:hanging="360"/>
+      </w:pPr>
+    </w:lvl>
+    <w:lvl w:ilvl="2">
+      <w:start w:val="1"/>
+      <w:numFmt w:val="decimal"/>
+      <w:lvlText w:val="%3."/>
+      <w:lvlJc w:val="left"/>
+      <w:pPr>
+        <w:ind w:left="2160" w:hanging="360"/>
+      </w:pPr>
+    </w:lvl>
+    <w:lvl w:ilvl="3">
+      <w:start w:val="1"/>
+      <w:numFmt w:val="decimal"/>
+      <w:lvlText w:val="%4."/>
+      <w:lvlJc w:val="left"/>
+      <w:pPr>
+        <w:ind w:left="2880" w:hanging="360"/>
+      </w:pPr>
+    </w:lvl>
+    <w:lvl w:ilvl="4">
+      <w:start w:val="1"/>
+      <w:numFmt w:val="decimal"/>
+      <w:lvlText w:val="%5."/>
+      <w:lvlJc w:val="left"/>
+      <w:pPr>
+        <w:ind w:left="3600" w:hanging="360"/>
+      </w:pPr>
+    </w:lvl>
+    <w:lvl w:ilvl="5">
+      <w:start w:val="1"/>
+      <w:numFmt w:val="decimal"/>
+      <w:lvlText w:val="%6."/>
+      <w:lvlJc w:val="left"/>
+      <w:pPr>
+        <w:ind w:left="4320" w:hanging="360"/>
+      </w:pPr>
+    </w:lvl>
+    <w:lvl w:ilvl="6">
+      <w:start w:val="1"/>
+      <w:numFmt w:val="decimal"/>
+      <w:lvlText w:val="%7."/>
+      <w:lvlJc w:val="left"/>
+      <w:pPr>
+        <w:ind w:left="5040" w:hanging="360"/>
+      </w:pPr>
+    </w:lvl>
+    <w:lvl w:ilvl="7">
+      <w:start w:val="1"/>
+      <w:numFmt w:val="decimal"/>
+      <w:lvlText w:val="%8."/>
+      <w:lvlJc w:val="left"/>
+      <w:pPr>
+        <w:ind w:left="5760" w:hanging="360"/>
+      </w:pPr>
+    </w:lvl>
+    <w:lvl w:ilvl="8">
+      <w:start w:val="1"/>
+      <w:numFmt w:val="decimal"/>
+      <w:lvlText w:val="%9."/>
+      <w:lvlJc w:val="left"/>
+      <w:pPr>
+        <w:ind w:left="6480" w:hanging="360"/>
+      </w:pPr>
+    </w:lvl>
+  </w:abstractNum>
+  <w:abstractNum w:abstractNumId="2">
+    <w:nsid w:val="20000002"/>
+    <w:multiLevelType w:val="hybridMultilevel"/>
+    <w:tmpl w:val="40000002"/>
+    <w:lvl w:ilvl="0">
+      <w:start w:val="1"/>
+      <w:numFmt w:val="decimal"/>
+      <w:lvlText w:val="%1."/>
+      <w:lvlJc w:val="left"/>
+      <w:pPr>
+        <w:ind w:left="720" w:hanging="360"/>
+      </w:pPr>
+    </w:lvl>
+    <w:lvl w:ilvl="1">
+      <w:start w:val="1"/>
+      <w:numFmt w:val="decimal"/>
+      <w:lvlText w:val="%2."/>
+      <w:lvlJc w:val="left"/>
+      <w:pPr>
+        <w:ind w:left="1440" w:hanging="360"/>
+      </w:pPr>
+    </w:lvl>
+    <w:lvl w:ilvl="2">
+      <w:start w:val="1"/>
+      <w:numFmt w:val="decimal"/>
+      <w:lvlText w:val="%3."/>
+      <w:lvlJc w:val="left"/>
+      <w:pPr>
+        <w:ind w:left="2160" w:hanging="360"/>
+      </w:pPr>
+    </w:lvl>
+    <w:lvl w:ilvl="3">
+      <w:start w:val="1"/>
+      <w:numFmt w:val="decimal"/>
+      <w:lvlText w:val="%4."/>
+      <w:lvlJc w:val="left"/>
+      <w:pPr>
+        <w:ind w:left="2880" w:hanging="360"/>
+      </w:pPr>
+    </w:lvl>
+    <w:lvl w:ilvl="4">
+      <w:start w:val="1"/>
+      <w:numFmt w:val="decimal"/>
+      <w:lvlText w:val="%5."/>
+      <w:lvlJc w:val="left"/>
+      <w:pPr>
+        <w:ind w:left="3600" w:hanging="360"/>
+      </w:pPr>
+    </w:lvl>
+    <w:lvl w:ilvl="5">
+      <w:start w:val="1"/>
+      <w:numFmt w:val="decimal"/>
+      <w:lvlText w:val="%6."/>
+      <w:lvlJc w:val="left"/>
+      <w:pPr>
+        <w:ind w:left="4320" w:hanging="360"/>
+      </w:pPr>
+    </w:lvl>
+    <w:lvl w:ilvl="6">
+      <w:start w:val="1"/>
+      <w:numFmt w:val="decimal"/>
+      <w:lvlText w:val="%7."/>
+      <w:lvlJc w:val="left"/>
+      <w:pPr>
+        <w:ind w:left="5040" w:hanging="360"/>
+      </w:pPr>
+    </w:lvl>
+    <w:lvl w:ilvl="7">
+      <w:start w:val="1"/>
+      <w:numFmt w:val="decimal"/>
+      <w:lvlText w:val="%8."/>
+      <w:lvlJc w:val="left"/>
+      <w:pPr>
+        <w:ind w:left="5760" w:hanging="360"/>
+      </w:pPr>
+    </w:lvl>
+    <w:lvl w:ilvl="8">
+      <w:start w:val="1"/>
+      <w:numFmt w:val="decimal"/>
+      <w:lvlText w:val="%9."/>
+      <w:lvlJc w:val="left"/>
+      <w:pPr>
+        <w:ind w:left="6480" w:hanging="360"/>
+      </w:pPr>
+    </w:lvl>
+  </w:abstractNum>
+  <w:abstractNum w:abstractNumId="3">
+    <w:nsid w:val="20000003"/>
+    <w:multiLevelType w:val="hybridMultilevel"/>
+    <w:tmpl w:val="40000003"/>
+    <w:lvl w:ilvl="0">
+      <w:start w:val="1"/>
+      <w:numFmt w:val="decimal"/>
+      <w:lvlText w:val="%1."/>
+      <w:lvlJc w:val="left"/>
+      <w:pPr>
+        <w:ind w:left="720" w:hanging="360"/>
+      </w:pPr>
+    </w:lvl>
+    <w:lvl w:ilvl="1">
+      <w:start w:val="1"/>
+      <w:numFmt w:val="decimal"/>
+      <w:lvlText w:val="%2."/>
+      <w:lvlJc w:val="left"/>
+      <w:pPr>
+        <w:ind w:left="1440" w:hanging="360"/>
+      </w:pPr>
+    </w:lvl>
+    <w:lvl w:ilvl="2">
+      <w:start w:val="1"/>
+      <w:numFmt w:val="decimal"/>
+      <w:lvlText w:val="%3."/>
+      <w:lvlJc w:val="left"/>
+      <w:pPr>
+        <w:ind w:left="2160" w:hanging="360"/>
+      </w:pPr>
+    </w:lvl>
+    <w:lvl w:ilvl="3">
+      <w:start w:val="1"/>
+      <w:numFmt w:val="decimal"/>
+      <w:lvlText w:val="%4."/>
+      <w:lvlJc w:val="left"/>
+      <w:pPr>
+        <w:ind w:left="2880" w:hanging="360"/>
+      </w:pPr>
+    </w:lvl>
+    <w:lvl w:ilvl="4">
+      <w:start w:val="1"/>
+      <w:numFmt w:val="decimal"/>
+      <w:lvlText w:val="%5."/>
+      <w:lvlJc w:val="left"/>
+      <w:pPr>
+        <w:ind w:left="3600" w:hanging="360"/>
+      </w:pPr>
+    </w:lvl>
+    <w:lvl w:ilvl="5">
+      <w:start w:val="1"/>
+      <w:numFmt w:val="decimal"/>
+      <w:lvlText w:val="%6."/>
+      <w:lvlJc w:val="left"/>
+      <w:pPr>
+        <w:ind w:left="4320" w:hanging="360"/>
+      </w:pPr>
+    </w:lvl>
+    <w:lvl w:ilvl="6">
+      <w:start w:val="1"/>
+      <w:numFmt w:val="decimal"/>
+      <w:lvlText w:val="%7."/>
+      <w:lvlJc w:val="left"/>
+      <w:pPr>
+        <w:ind w:left="5040" w:hanging="360"/>
+      </w:pPr>
+    </w:lvl>
+    <w:lvl w:ilvl="7">
+      <w:start w:val="1"/>
+      <w:numFmt w:val="decimal"/>
+      <w:lvlText w:val="%8."/>
+      <w:lvlJc w:val="left"/>
+      <w:pPr>
+        <w:ind w:left="5760" w:hanging="360"/>
+      </w:pPr>
+    </w:lvl>
+    <w:lvl w:ilvl="8">
+      <w:start w:val="1"/>
+      <w:numFmt w:val="decimal"/>
+      <w:lvlText w:val="%9."/>
+      <w:lvlJc w:val="left"/>
+      <w:pPr>
+        <w:ind w:left="6480" w:hanging="360"/>
+      </w:pPr>
+    </w:lvl>
+  </w:abstractNum>
   <w:num w:numId="1">
     <w:abstractNumId w:val="0"/>
   </w:num>
@@ -338,194 +682,6 @@
   <w:num w:numId="4">
     <w:abstractNumId w:val="3"/>
   </w:num>
-  <w:abstractNum w:abstractNumId="0">
-    <w:lvl w:ilvl="0">
-      <w:numFmt w:val="bullet"/>
-      <w:lvlText w:val="•"/>
-      <w:start w:val="1"/>
-    </w:lvl>
-    <w:lvl w:ilvl="1">
-      <w:numFmt w:val="bullet"/>
-      <w:lvlText w:val="◦"/>
-      <w:start w:val="1"/>
-    </w:lvl>
-    <w:lvl w:ilvl="2">
-      <w:numFmt w:val="bullet"/>
-      <w:lvlText w:val="▪"/>
-      <w:start w:val="1"/>
-    </w:lvl>
-    <w:lvl w:ilvl="3">
-      <w:numFmt w:val="bullet"/>
-      <w:lvlText w:val="▫"/>
-      <w:start w:val="1"/>
-    </w:lvl>
-    <w:lvl w:ilvl="4">
-      <w:numFmt w:val="bullet"/>
-      <w:lvlText w:val="•"/>
-      <w:start w:val="1"/>
-    </w:lvl>
-    <w:lvl w:ilvl="5">
-      <w:numFmt w:val="bullet"/>
-      <w:lvlText w:val="◦"/>
-      <w:start w:val="1"/>
-    </w:lvl>
-    <w:lvl w:ilvl="6">
-      <w:numFmt w:val="bullet"/>
-      <w:lvlText w:val="▪"/>
-      <w:start w:val="1"/>
-    </w:lvl>
-    <w:lvl w:ilvl="7">
-      <w:numFmt w:val="bullet"/>
-      <w:lvlText w:val="▫"/>
-      <w:start w:val="1"/>
-    </w:lvl>
-    <w:lvl w:ilvl="8">
-      <w:numFmt w:val="bullet"/>
-      <w:lvlText w:val="•"/>
-      <w:start w:val="1"/>
-    </w:lvl>
-  </w:abstractNum>
-  <w:abstractNum w:abstractNumId="1">
-    <w:lvl w:ilvl="0">
-      <w:numFmt w:val="decimal"/>
-      <w:lvlText w:val="%1."/>
-      <w:start w:val="1"/>
-    </w:lvl>
-    <w:lvl w:ilvl="1">
-      <w:numFmt w:val="decimal"/>
-      <w:lvlText w:val="%2."/>
-      <w:start w:val="1"/>
-    </w:lvl>
-    <w:lvl w:ilvl="2">
-      <w:numFmt w:val="decimal"/>
-      <w:lvlText w:val="%3."/>
-      <w:start w:val="1"/>
-    </w:lvl>
-    <w:lvl w:ilvl="3">
-      <w:numFmt w:val="decimal"/>
-      <w:lvlText w:val="%4."/>
-      <w:start w:val="1"/>
-    </w:lvl>
-    <w:lvl w:ilvl="4">
-      <w:numFmt w:val="decimal"/>
-      <w:lvlText w:val="%5."/>
-      <w:start w:val="1"/>
-    </w:lvl>
-    <w:lvl w:ilvl="5">
-      <w:numFmt w:val="decimal"/>
-      <w:lvlText w:val="%6."/>
-      <w:start w:val="1"/>
-    </w:lvl>
-    <w:lvl w:ilvl="6">
-      <w:numFmt w:val="decimal"/>
-      <w:lvlText w:val="%7."/>
-      <w:start w:val="1"/>
-    </w:lvl>
-    <w:lvl w:ilvl="7">
-      <w:numFmt w:val="decimal"/>
-      <w:lvlText w:val="%8."/>
-      <w:start w:val="1"/>
-    </w:lvl>
-    <w:lvl w:ilvl="8">
-      <w:numFmt w:val="decimal"/>
-      <w:lvlText w:val="%9."/>
-      <w:start w:val="1"/>
-    </w:lvl>
-  </w:abstractNum>
-  <w:abstractNum w:abstractNumId="2">
-    <w:lvl w:ilvl="0">
-      <w:numFmt w:val="decimal"/>
-      <w:lvlText w:val="%1."/>
-      <w:start w:val="1"/>
-    </w:lvl>
-    <w:lvl w:ilvl="1">
-      <w:numFmt w:val="decimal"/>
-      <w:lvlText w:val="%2."/>
-      <w:start w:val="1"/>
-    </w:lvl>
-    <w:lvl w:ilvl="2">
-      <w:numFmt w:val="decimal"/>
-      <w:lvlText w:val="%3."/>
-      <w:start w:val="1"/>
-    </w:lvl>
-    <w:lvl w:ilvl="3">
-      <w:numFmt w:val="decimal"/>
-      <w:lvlText w:val="%4."/>
-      <w:start w:val="1"/>
-    </w:lvl>
-    <w:lvl w:ilvl="4">
-      <w:numFmt w:val="decimal"/>
-      <w:lvlText w:val="%5."/>
-      <w:start w:val="1"/>
-    </w:lvl>
-    <w:lvl w:ilvl="5">
-      <w:numFmt w:val="decimal"/>
-      <w:lvlText w:val="%6."/>
-      <w:start w:val="1"/>
-    </w:lvl>
-    <w:lvl w:ilvl="6">
-      <w:numFmt w:val="decimal"/>
-      <w:lvlText w:val="%7."/>
-      <w:start w:val="1"/>
-    </w:lvl>
-    <w:lvl w:ilvl="7">
-      <w:numFmt w:val="decimal"/>
-      <w:lvlText w:val="%8."/>
-      <w:start w:val="1"/>
-    </w:lvl>
-    <w:lvl w:ilvl="8">
-      <w:numFmt w:val="decimal"/>
-      <w:lvlText w:val="%9."/>
-      <w:start w:val="1"/>
-    </w:lvl>
-  </w:abstractNum>
-  <w:abstractNum w:abstractNumId="3">
-    <w:lvl w:ilvl="0">
-      <w:numFmt w:val="decimal"/>
-      <w:lvlText w:val="%1."/>
-      <w:start w:val="1"/>
-    </w:lvl>
-    <w:lvl w:ilvl="1">
-      <w:numFmt w:val="decimal"/>
-      <w:lvlText w:val="%2."/>
-      <w:start w:val="1"/>
-    </w:lvl>
-    <w:lvl w:ilvl="2">
-      <w:numFmt w:val="decimal"/>
-      <w:lvlText w:val="%3."/>
-      <w:start w:val="1"/>
-    </w:lvl>
-    <w:lvl w:ilvl="3">
-      <w:numFmt w:val="decimal"/>
-      <w:lvlText w:val="%4."/>
-      <w:start w:val="1"/>
-    </w:lvl>
-    <w:lvl w:ilvl="4">
-      <w:numFmt w:val="decimal"/>
-      <w:lvlText w:val="%5."/>
-      <w:start w:val="1"/>
-    </w:lvl>
-    <w:lvl w:ilvl="5">
-      <w:numFmt w:val="decimal"/>
-      <w:lvlText w:val="%6."/>
-      <w:start w:val="1"/>
-    </w:lvl>
-    <w:lvl w:ilvl="6">
-      <w:numFmt w:val="decimal"/>
-      <w:lvlText w:val="%7."/>
-      <w:start w:val="1"/>
-    </w:lvl>
-    <w:lvl w:ilvl="7">
-      <w:numFmt w:val="decimal"/>
-      <w:lvlText w:val="%8."/>
-      <w:start w:val="1"/>
-    </w:lvl>
-    <w:lvl w:ilvl="8">
-      <w:numFmt w:val="decimal"/>
-      <w:lvlText w:val="%9."/>
-      <w:start w:val="1"/>
-    </w:lvl>
-  </w:abstractNum>
 </w:numbering>
 </file>
 

</xml_diff>